<commit_message>
Remove 10M users metric from CV and recompile outputs
</commit_message>
<xml_diff>
--- a/cv-fullstack/outputs/cv-fullstack.docx
+++ b/cv-fullstack/outputs/cv-fullstack.docx
@@ -76,7 +76,7 @@
         <w:pStyle w:val="BodyText"/>
       </w:pPr>
       <w:r>
-        <w:t xml:space="preserve">Backend Developer (Node.js/TypeScript) with production experience on serverless, high-concurrency systems serving 10M+ users on AWS. Strong in NestJS/Express, Redis, queues (SQS, BullMQ), DDD and Hexagonal Architecture, owning delivery from system design to CI/CD and testing. Former Tech Lead – Top 30 UniVentures 2025.</w:t>
+        <w:t xml:space="preserve">Backend Developer (Node.js/TypeScript) with production experience on serverless, high-concurrency systems on AWS. Strong in NestJS/Express, Redis, queues (SQS, BullMQ), DDD and Hexagonal Architecture, owning delivery from system design to CI/CD and testing. Former Tech Lead – Top 30 UniVentures 2025.</w:t>
       </w:r>
     </w:p>
     <w:p>
@@ -94,7 +94,7 @@
         <w:t xml:space="preserve"> </w:t>
       </w:r>
       <w:r>
-        <w:t xml:space="preserve">NestJS, Express.js, Node.js, TypeScript, WebSocket, Spring Boot, PHP</w:t>
+        <w:t xml:space="preserve">NestJS, Express.js, Node.js, TypeScript, WebSocket</w:t>
       </w:r>
       <w:r>
         <w:br/>
@@ -142,7 +142,7 @@
         <w:t xml:space="preserve"> </w:t>
       </w:r>
       <w:r>
-        <w:t xml:space="preserve">AWS (Lambda, S3, SQS, CloudFront, EC2), Docker, GitLab CI/CD, GitHub Actions</w:t>
+        <w:t xml:space="preserve">AWS (Lambda, S3, SQS, CloudFront, EC2), Docker, GitLab CI/CD</w:t>
       </w:r>
       <w:r>
         <w:br/>
@@ -184,13 +184,13 @@
           <w:b/>
           <w:bCs/>
         </w:rPr>
-        <w:t xml:space="preserve">Tools:</w:t>
-      </w:r>
-      <w:r>
-        <w:t xml:space="preserve"> </w:t>
-      </w:r>
-      <w:r>
-        <w:t xml:space="preserve">Alibaba KMS, MinIO, LocalStack</w:t>
+        <w:t xml:space="preserve">Tools &amp; OS:</w:t>
+      </w:r>
+      <w:r>
+        <w:t xml:space="preserve"> </w:t>
+      </w:r>
+      <w:r>
+        <w:t xml:space="preserve">Alibaba KMS, MinIO, LocalStack, Arch Linux, NixOS</w:t>
       </w:r>
       <w:r>
         <w:br/>
@@ -218,7 +218,7 @@
           <w:b/>
           <w:bCs/>
         </w:rPr>
-        <w:t xml:space="preserve">Nexon Dev Vina – Nexon Web Builder</w:t>
+        <w:t xml:space="preserve">Nexon Dev Vina</w:t>
       </w:r>
       <w:r>
         <w:t xml:space="preserve"> </w:t>
@@ -262,7 +262,7 @@
         <w:pStyle w:val="BodyText"/>
       </w:pPr>
       <w:r>
-        <w:t xml:space="preserve">Designed and developed core APIs for the Admin CMS and end-user site builder powering official websites for Nexon game titles; shipped V1 to production serving 10 million end users.</w:t>
+        <w:t xml:space="preserve">Designed and developed core APIs for the Admin CMS and web platform powering official websites for Nexon’s flagship game titles; collaborated directly with Headquarters (HQ) teams to ship V1 to production.</w:t>
       </w:r>
     </w:p>
     <w:p>
@@ -271,6 +271,22 @@
       </w:pPr>
       <w:r>
         <w:t xml:space="preserve">Redesigned the static-site build pipeline into parallelized, queue-based processing (Lambda + SQS + S3), cutting build time by 80%; refactored legacy modules with DDD/Hexagonal Architecture.</w:t>
+      </w:r>
+    </w:p>
+    <w:p>
+      <w:pPr>
+        <w:pStyle w:val="BodyText"/>
+      </w:pPr>
+      <w:r>
+        <w:t xml:space="preserve">Contributed to migrating the platform from single-region to a multi-region, multi-lingual (i18n) architecture to support low-latency global access.</w:t>
+      </w:r>
+    </w:p>
+    <w:p>
+      <w:pPr>
+        <w:pStyle w:val="BodyText"/>
+      </w:pPr>
+      <w:r>
+        <w:t xml:space="preserve">Participated in the end-to-end deployment lifecycle across Dev, Stage, Pre, and Live environments.</w:t>
       </w:r>
     </w:p>
     <w:p>
@@ -282,7 +298,7 @@
           <w:b/>
           <w:bCs/>
         </w:rPr>
-        <w:t xml:space="preserve">DXDLabs – Digital Signature</w:t>
+        <w:t xml:space="preserve">DXDLabs</w:t>
       </w:r>
       <w:r>
         <w:t xml:space="preserve"> </w:t>
@@ -398,7 +414,7 @@
         <w:pStyle w:val="BodyText"/>
       </w:pPr>
       <w:r>
-        <w:t xml:space="preserve">Led technical delivery for a cross-university team (RMIT, UIT) – task delegation, API documentation, code review – with CI/CD via GitHub Actions to AWS EC2. Demo:</w:t>
+        <w:t xml:space="preserve">Led technical delivery for a cross-university team (RMIT, UIT) – task delegation, API documentation, code review – with automated CI/CD to AWS EC2. Demo:</w:t>
       </w:r>
       <w:r>
         <w:t xml:space="preserve"> </w:t>

</xml_diff>